<commit_message>
Add a blank line before the sequence diagram in LAB8_Doc_HuynhDaiLuc1250080109.docx
</commit_message>
<xml_diff>
--- a/LAB_OOSD/LAB8/LAB8_Doc_HuynhDaiLuc1250080109.docx
+++ b/LAB_OOSD/LAB8/LAB8_Doc_HuynhDaiLuc1250080109.docx
@@ -18350,19 +18350,17 @@
         <w:pStyle w:val="Heading1"/>
       </w:pPr>
       <w:r>
+        <w:lastRenderedPageBreak/>
         <w:t>CÂU 5: ACTIVITY DIAGRAM</w:t>
       </w:r>
     </w:p>
     <w:p>
       <w:r>
-        <w:rPr>
-          <w:noProof/>
-        </w:rPr>
         <w:drawing>
-          <wp:inline distT="0" distB="0" distL="0" distR="0" wp14:anchorId="08872E65" wp14:editId="450B9B01">
-            <wp:extent cx="4152900" cy="2781300"/>
+          <wp:inline distT="0" distB="0" distL="0" distR="0" wp14:anchorId="6F047970" wp14:editId="3F9F77C7">
+            <wp:extent cx="5890846" cy="6507982"/>
             <wp:effectExtent l="0" t="0" r="0" b="0"/>
-            <wp:docPr id="10" name="Picture 10"/>
+            <wp:docPr id="1848986295" name="Picture 10"/>
             <wp:cNvGraphicFramePr>
               <a:graphicFrameLocks xmlns:a="http://schemas.openxmlformats.org/drawingml/2006/main" noChangeAspect="1"/>
             </wp:cNvGraphicFramePr>
@@ -18391,7 +18389,7 @@
                   <pic:spPr bwMode="auto">
                     <a:xfrm>
                       <a:off x="0" y="0"/>
-                      <a:ext cx="4152900" cy="2781300"/>
+                      <a:ext cx="5895616" cy="6513252"/>
                     </a:xfrm>
                     <a:prstGeom prst="rect">
                       <a:avLst/>
@@ -18410,6 +18408,13 @@
     </w:p>
     <w:p>
       <w:pPr>
+        <w:rPr>
+          <w:lang w:val="vi-VN"/>
+        </w:rPr>
+      </w:pPr>
+    </w:p>
+    <w:p>
+      <w:pPr>
         <w:pStyle w:val="Heading1"/>
       </w:pPr>
       <w:r>
@@ -18418,16 +18423,21 @@
     </w:p>
     <w:p/>
     <w:p>
-      <w:r>
+      <w:pPr>
         <w:rPr>
-          <w:noProof/>
+          <w:lang w:val="vi-VN"/>
+        </w:rPr>
+      </w:pPr>
+      <w:r>
+        <w:rPr>
+          <w:lang w:val="vi-VN"/>
         </w:rPr>
         <w:lastRenderedPageBreak/>
         <w:drawing>
-          <wp:inline distT="0" distB="0" distL="0" distR="0" wp14:anchorId="694645AF" wp14:editId="47EC3FFD">
-            <wp:extent cx="5486400" cy="3467100"/>
-            <wp:effectExtent l="0" t="0" r="0" b="0"/>
-            <wp:docPr id="12" name="Picture 12"/>
+          <wp:inline distT="0" distB="0" distL="0" distR="0" wp14:anchorId="1AC1B95C" wp14:editId="10F91B78">
+            <wp:extent cx="5943600" cy="3648075"/>
+            <wp:effectExtent l="0" t="0" r="0" b="9525"/>
+            <wp:docPr id="177912107" name="Picture 1"/>
             <wp:cNvGraphicFramePr>
               <a:graphicFrameLocks xmlns:a="http://schemas.openxmlformats.org/drawingml/2006/main" noChangeAspect="1"/>
             </wp:cNvGraphicFramePr>
@@ -18435,39 +18445,23 @@
               <a:graphicData uri="http://schemas.openxmlformats.org/drawingml/2006/picture">
                 <pic:pic xmlns:pic="http://schemas.openxmlformats.org/drawingml/2006/picture">
                   <pic:nvPicPr>
-                    <pic:cNvPr id="0" name="Picture 41"/>
-                    <pic:cNvPicPr>
-                      <a:picLocks noChangeAspect="1" noChangeArrowheads="1"/>
-                    </pic:cNvPicPr>
+                    <pic:cNvPr id="177912107" name=""/>
+                    <pic:cNvPicPr/>
                   </pic:nvPicPr>
-                  <pic:blipFill rotWithShape="1">
-                    <a:blip r:embed="rId9" cstate="print">
-                      <a:extLst>
-                        <a:ext uri="{28A0092B-C50C-407E-A947-70E740481C1C}">
-                          <a14:useLocalDpi xmlns:a14="http://schemas.microsoft.com/office/drawing/2010/main" val="0"/>
-                        </a:ext>
-                      </a:extLst>
-                    </a:blip>
-                    <a:srcRect l="-1" r="-582" b="11300"/>
-                    <a:stretch/>
+                  <pic:blipFill>
+                    <a:blip r:embed="rId9"/>
+                    <a:stretch>
+                      <a:fillRect/>
+                    </a:stretch>
                   </pic:blipFill>
-                  <pic:spPr bwMode="auto">
+                  <pic:spPr>
                     <a:xfrm>
                       <a:off x="0" y="0"/>
-                      <a:ext cx="5493104" cy="3471336"/>
+                      <a:ext cx="5943600" cy="3648075"/>
                     </a:xfrm>
                     <a:prstGeom prst="rect">
                       <a:avLst/>
                     </a:prstGeom>
-                    <a:noFill/>
-                    <a:ln>
-                      <a:noFill/>
-                    </a:ln>
-                    <a:extLst>
-                      <a:ext uri="{53640926-AAD7-44D8-BBD7-CCE9431645EC}">
-                        <a14:shadowObscured xmlns:a14="http://schemas.microsoft.com/office/drawing/2010/main"/>
-                      </a:ext>
-                    </a:extLst>
                   </pic:spPr>
                 </pic:pic>
               </a:graphicData>

</xml_diff>